<commit_message>
chore: update FYDP report draft and generation script
</commit_message>
<xml_diff>
--- a/Alzheimer_Peptide_FYDP_Report_DRAFT.docx
+++ b/Alzheimer_Peptide_FYDP_Report_DRAFT.docx
@@ -4806,7 +4806,7 @@
           <w:rFonts w:ascii="Century" w:hAnsi="Century" w:cs="Century" w:eastAsia="Century"/>
           <w:w w:val="105"/>
         </w:rPr>
-        <w:t xml:space="preserve">Clinical diagnosis of Alzheimer's disease relies heavily on cognitive evaluations paired with MRI or PET imaging. While these scans confirm pathology, they are expensive and often detect changes only after substantial neurodegeneration has set in. This study investigates whether primary peptide sequences alone can act as a fast, accessible screening tool by predicting amyloid aggregation. We collected 2,001 peptide entries from the CPAD 2.0 repository, removed duplicates, and resolved class labels into amyloid and non-amyloid categories. To support different learning algorithms, we represented sequences as padded integer matrices for neural networks and flattened one-hot matrices for tabular models. We trained and compared six architectures: three classical baselines (Logistic Regression, Random Forest, and Support Vector Machine) evaluated through stratified five-fold cross-validation, and three recurrent and convolutional models (1D-CNN, standard LSTM, and Bidirectional LSTM) regularized with early stopping. On a 20% stratified test set, the 1D-CNN performed best, achieving 81.05% accuracy, an F1-score of 0.8146, and an ROC-AUC of 0.8925. The Bidirectional LSTM reached 80.30% accuracy, whereas classical classifiers scored between 76.56% and 77.81%. We also packaged the trained CNN into a lightweight Flask web interface for live sequence evaluation. These results demonstrate that primary sequence structure holds measurable signal for initial amyloid risk assessment, offering a practical computational step prior to clinical testing.</w:t>
+        <w:t xml:space="preserve">Clinical diagnosis of Alzheimer's disease relies heavily on cognitive evaluations paired with MRI or PET imaging. While these scans confirm pathology, they are expensive and often detect changes only after substantial neurodegeneration has set in. This study investigates whether primary peptide sequences alone can act as a fast, accessible screening tool by predicting amyloid aggregation. We collected 2,001 peptide entries from the CPAD 2.0 repository, removed duplicates, and resolved class labels into amyloid and non-amyloid categories. To support different learning algorithms, we represented sequences as padded integer matrices for neural networks and flattened one-hot matrices for tabular models. We trained and compared six architectures: three classical baselines (Logistic Regression, Random Forest, and Support Vector Machine) evaluated through stratified five-fold cross-validation, and three recurrent and convolutional models (1D-CNN, standard LSTM, and Bidirectional LSTM) regularized with early stopping. On a 20% stratified test set, the 1D-CNN performed best, achieving 81.05% accuracy, an F1-score of 0.8146, and an ROC-AUC of 0.8925. The Bidirectional LSTM reached 80.30% accuracy, whereas classical classifiers scored between 76.56% and 77.81%. We also packaged the trained CNN into a lightweight Flask web interface for live sequence evaluation. These results show that primary amino acid sequences carry measurable signal for preliminary amyloid risk assessment before clinical testing.</w:t>
       </w:r>
     </w:p>
     <w:p>
@@ -8940,7 +8940,7 @@
           <w:b/>
           <w:w w:val="105"/>
         </w:rPr>
-        <w:t xml:space="preserve">This chapter outlines the research problem, explains the clinical need for accessible peptide screening, defines our technical objectives, and summarizes the structure of the report.</w:t>
+        <w:t xml:space="preserve">This chapter introduces the research problem, explains the need for accessible peptide screening, defines our technical objectives, and summarizes the structure of the report.</w:t>
       </w:r>
     </w:p>
     <w:p>
@@ -9008,7 +9008,7 @@
           <w:rFonts w:ascii="Century" w:hAnsi="Century" w:cs="Century" w:eastAsia="Century"/>
           <w:w w:val="105"/>
         </w:rPr>
-        <w:t xml:space="preserve">Alzheimer's disease is the most common cause of dementia worldwide. As the condition progresses, it causes irreversible memory loss and cognitive decline, creating major burdens for patients, families, and healthcare providers. Today, definitive clinical assessment combines cognitive testing with neuroimaging such as structural MRI and amyloid PET scans. Although these imaging modalities are accurate, they require specialized hospital facilities and high costs, and they typically identify abnormalities only after severe neuronal loss has occurred.</w:t>
+        <w:t xml:space="preserve">Alzheimer's disease is the most common cause of dementia worldwide. As the disease progresses, it causes irreversible memory loss and cognitive decline that place heavy burdens on patients, families, and healthcare systems. Today, definitive clinical assessment combines cognitive testing with neuroimaging such as structural MRI and amyloid PET scans. While brain scans are accurate, they are expensive, require specialized hospital equipment, and usually detect damage only after substantial neuronal loss.</w:t>
       </w:r>
     </w:p>
     <w:p>
@@ -9026,7 +9026,7 @@
           <w:rFonts w:ascii="Century" w:hAnsi="Century" w:cs="Century" w:eastAsia="Century"/>
           <w:w w:val="105"/>
         </w:rPr>
-        <w:t xml:space="preserve">At the biochemical level, Alzheimer's disease is driven by the misfolding and aggregation of amyloid-beta (Aβ) peptides into oligomers and fibril deposits [9], [10]. Whether a peptide aggregates depends directly on its primary amino acid sequence. Because sequence data can be analyzed computationally, machine learning models offer a direct way to estimate aggregation tendency without laboratory synthesis or hospital equipment. In this project, we train and evaluate six machine learning and deep learning models on verified peptide sequences from the CPAD 2.0 database [1] to classify sequences as amyloid-forming or non-amyloid.</w:t>
+        <w:t xml:space="preserve">At the biochemical level, Alzheimer's disease is driven by the misfolding and aggregation of amyloid-beta (Aβ) peptides into oligomers and fibril deposits [9], [10]. Whether a peptide aggregates depends directly on its primary amino acid sequence. Because sequence data can be processed computationally, machine learning models offer a way to estimate aggregation tendency without laboratory synthesis or hospital equipment. In this project, we train and evaluate six machine learning and deep learning models on verified peptide sequences from the CPAD 2.0 database [1] to classify sequences as amyloid-forming or non-amyloid.</w:t>
       </w:r>
     </w:p>
     <w:p>
@@ -9093,7 +9093,7 @@
           <w:rFonts w:ascii="Century" w:hAnsi="Century" w:cs="Century" w:eastAsia="Century"/>
           <w:w w:val="105"/>
         </w:rPr>
-        <w:t xml:space="preserve">Routine population screening for Alzheimer's is currently impractical because clinical neuroimaging is too expensive and resource intensive. A computational model that operates directly on amino acid strings runs in milliseconds on regular computer hardware, making it suitable for high-throughput initial screening. In research workflows, such a tool can help bioinformaticians filter potential amyloid candidates before investing in costly laboratory assays. In addition, evaluating both classical tabular algorithms and modern deep neural architectures under identical validation conditions provides clear evidence regarding which model designs capture sequence motifs most effectively.</w:t>
+        <w:t xml:space="preserve">Routine population screening for Alzheimer's is currently impractical because clinical neuroimaging is too expensive and resource intensive. A computational model that operates directly on amino acid strings runs in milliseconds on regular computer hardware, making it suitable for high-throughput initial screening. In research workflows, such a tool helps bioinformaticians filter potential amyloid candidates before investing in costly laboratory assays. Comparing classical algorithms with deep neural networks on identical data also shows which architectures identify sequence motifs most effectively.</w:t>
       </w:r>
     </w:p>
     <w:p>
@@ -9396,7 +9396,7 @@
         <w:rPr>
           <w:rFonts w:ascii="Century" w:hAnsi="Century" w:cs="Century" w:eastAsia="Century"/>
         </w:rPr>
-        <w:t xml:space="preserve">This project delivers an end-to-end software pipeline that processes raw peptide sequences, trains multiple classifiers, and provides real-time predictions through an interactive web interface. It also provides an empirical benchmark comparing classical and deep learning models on peptide aggregation data.</w:t>
+        <w:t xml:space="preserve">This project delivers a complete pipeline that processes raw peptide sequences, trains multiple classifiers, and serves real-time predictions through an interactive web interface. It also establishes an empirical benchmark comparing classical and deep learning models on peptide aggregation data.</w:t>
       </w:r>
     </w:p>
     <w:p>
@@ -9696,7 +9696,7 @@
           <w:rFonts w:ascii="Century" w:hAnsi="Century" w:cs="Century" w:eastAsia="Century"/>
           <w:w w:val="105"/>
         </w:rPr>
-        <w:t xml:space="preserve">Alzheimer's disease is the leading cause of dementia among older adults. In the brain, the disease triggers progressive loss of synapses and neurons, especially in regions responsible for memory and cognition. Standard clinical diagnosis relies on cognitive tests such as the MMSE along with structural MRI and PET scans. While effective, brain imaging is expensive and requires hospital infrastructure, often detecting tissue changes only after significant cognitive impairment has already developed.</w:t>
+        <w:t xml:space="preserve">Alzheimer's disease is the leading cause of dementia among older adults. In the brain, the disease causes progressive synapse and neuron loss, particularly in areas supporting memory and cognition. Standard clinical diagnosis pairs cognitive tests like the MMSE with structural MRI and PET scans. While effective, neuroimaging requires hospital facilities, costs thousands of dollars, and often detects structural changes only after noticeable cognitive impairment appears.</w:t>
       </w:r>
     </w:p>
     <w:p>
@@ -9732,7 +9732,7 @@
           <w:rFonts w:ascii="Century" w:hAnsi="Century" w:cs="Century" w:eastAsia="Century"/>
           <w:w w:val="105"/>
         </w:rPr>
-        <w:t xml:space="preserve">Prior bioinformatics studies demonstrate that primary sequence structure holds clear diagnostic value for predicting peptide aggregation [8]. Deep learning architectures such as 1D-CNNs and LSTMs can extract localized motifs and sequential dependencies directly from text sequences without manual feature engineering [7]. Databases such as CPAD 2.0 [1] collect experimentally verified amyloid and non-amyloid peptide sequences, providing an established dataset for systematic model comparisons.</w:t>
+        <w:t xml:space="preserve">Prior bioinformatics studies show that primary sequence composition helps predict peptide aggregation [8]. Deep learning architectures such as 1D-CNNs and LSTMs can extract localized motifs and sequential dependencies directly from text sequences without manual feature engineering [7]. Databases such as CPAD 2.0 [1] collect experimentally verified amyloid and non-amyloid peptide sequences, providing an established dataset for systematic model comparisons.</w:t>
       </w:r>
     </w:p>
     <w:p>
@@ -9973,20 +9973,17 @@
             <w:tcW w:w="2373" w:type="dxa"/>
           </w:tcPr>
           <w:p>
-            <w:pPr>
-              <w:pStyle w:val="TableParagraph"/>
-              <w:rPr>
-                <w:rFonts w:ascii="Century" w:hAnsi="Century"/>
+            <w:r>
+              <w:rPr>
+                <w:rFonts w:ascii="Century" w:hAnsi="Century" w:cs="Century" w:eastAsia="Century"/>
+              </w:rPr>
+            </w:r>
+            <w:r>
+              <w:rPr>
+                <w:rFonts w:ascii="Century" w:hAnsi="Century" w:cs="Century" w:eastAsia="Century"/>
                 <w:b/>
               </w:rPr>
-            </w:pPr>
-            <w:r>
-              <w:rPr>
-                <w:rFonts w:ascii="Century" w:hAnsi="Century" w:cs="Century" w:eastAsia="Century"/>
-                <w:b/>
-                <w:w w:val="130"/>
-              </w:rPr>
-              <w:t>Key Findings</w:t>
+              <w:t>Main Findings</w:t>
             </w:r>
           </w:p>
         </w:tc>
@@ -10801,7 +10798,7 @@
           <w:rFonts w:ascii="Century" w:hAnsi="Century" w:cs="Century" w:eastAsia="Century"/>
           <w:w w:val="105"/>
         </w:rPr>
-        <w:t xml:space="preserve">Hassan et al. [5] built a multimodal deep learning pipeline using MRI and PET scans, fine-tuning a VGG16 convolutional network to classify disease stages. Their results showed that convolutional filters effectively capture structural brain changes. However, clinical neuroimaging remains too expensive for broad population screening, highlighting the value of sequence-based approaches.</w:t>
+        <w:t xml:space="preserve">Hassan et al. [5] built a multimodal deep learning pipeline using MRI and PET scans, fine-tuning a VGG16 convolutional network to classify disease stages. Their results showed that convolutional filters effectively capture structural brain changes. However, clinical neuroimaging remains too expensive for broad population screening, making sequence-based computational screening a practical alternative.</w:t>
       </w:r>
     </w:p>
     <w:p>
@@ -18059,7 +18056,7 @@
           <w:rFonts w:ascii="Century" w:hAnsi="Century" w:cs="Century" w:eastAsia="Century"/>
           <w:w w:val="105"/>
         </w:rPr>
-        <w:t xml:space="preserve">The 1D-CNN achieved the highest overall performance on the test set, reaching 81.05% accuracy, an F1-score of 0.8146, and an ROC-AUC of 0.8925. This result aligns with findings by Wang et al. [7], who showed that convolutional filters effectively capture localized aggregation traits. Amyloid formation often depends on short, contiguous segments of 3 to 6 amino acids, such as the KLVFFA motif in amyloid-beta. Convolutional filters slide across the sequence to detect these critical motifs regardless of where they appear along the peptide chain.</w:t>
+        <w:t xml:space="preserve">The 1D-CNN achieved the highest overall performance on the test set, reaching 81.05% accuracy, an F1-score of 0.8146, and an ROC-AUC of 0.8925. This result aligns with findings by Wang et al. [7], who showed that convolutional filters effectively capture localized aggregation traits. Amyloid formation often depends on short, contiguous segments of 3 to 6 amino acids, such as the KLVFFA motif in amyloid-beta. Convolutional filters slide across the sequence to detect these local motifs regardless of where they appear along the peptide chain.</w:t>
       </w:r>
     </w:p>
     <w:p>
@@ -19009,7 +19006,7 @@
           <w:rFonts w:ascii="Century" w:hAnsi="Century" w:cs="Century" w:eastAsia="Century"/>
           <w:w w:val="105"/>
         </w:rPr>
-        <w:t xml:space="preserve">Client-server communication follows HTTP/1.1 REST conventions, exchanging JSON payloads through the /predict endpoint. We chose JSON over HTTP because the payload consists of a short sequence string and scalar predictions, keeping the communication layer lightweight and dependable.</w:t>
+        <w:t xml:space="preserve">Client-server communication follows HTTP/1.1 REST conventions, exchanging JSON payloads through the /predict endpoint. We used JSON formatted data rather than XML or custom binary structures because the payloads contain only sequence strings and scalar prediction values, keeping the interface simple and easy to debug.</w:t>
       </w:r>
     </w:p>
     <w:p>
@@ -22759,7 +22756,7 @@
         <w:rPr>
           <w:rFonts w:ascii="Century" w:hAnsi="Century" w:cs="Century" w:eastAsia="Century"/>
         </w:rPr>
-        <w:t xml:space="preserve">We built and evaluated a computational screening framework that assesses Alzheimer's disease risk from primary peptide sequences. By comparing three classical machine learning classifiers (Logistic Regression, Random Forest, and Support Vector Machine) with three deep neural networks (1D-CNN, LSTM, and Bidirectional LSTM), we established an empirical benchmark on the CPAD 2.0 dataset. We cleaned and deduplicated 2,001 peptide records and encoded them into padded integer arrays and one-hot matrices. On a 20% stratified test set, the 1D-CNN achieved the best overall performance, reaching 81.05% accuracy, an F1-score of 0.8146, and an ROC-AUC of 0.8925. The Bidirectional LSTM achieved second place with 80.30% accuracy, while classical baselines performed between 76.56% and 77.81%. We also deployed the trained CNN in a Flask web application that provides real-time predictions, probability scores, and risk badges. These results demonstrate that primary sequence features provide a meaningful, non-invasive signal for preliminary amyloid risk evaluation.</w:t>
+        <w:t xml:space="preserve">We built and evaluated a computational screening framework that assesses Alzheimer's disease risk from primary peptide sequences. By comparing three classical machine learning classifiers (Logistic Regression, Random Forest, and Support Vector Machine) with three deep neural networks (1D-CNN, LSTM, and Bidirectional LSTM), we established an empirical benchmark on the CPAD 2.0 dataset. We cleaned and deduplicated 2,001 peptide records and encoded them into padded integer arrays and one-hot matrices. On a 20% stratified test set, the 1D-CNN achieved the best overall performance, reaching 81.05% accuracy, an F1-score of 0.8146, and an ROC-AUC of 0.8925. The Bidirectional LSTM achieved second place with 80.30% accuracy, while classical baselines performed between 76.56% and 77.81%. We also deployed the trained CNN in a Flask web application that provides real-time predictions, probability scores, and risk badges. These results confirm that primary sequence features provide a reliable, non-invasive signal for preliminary amyloid risk evaluation.</w:t>
       </w:r>
     </w:p>
     <w:p>
@@ -22852,7 +22849,7 @@
           <w:rFonts w:ascii="Century" w:hAnsi="Century" w:cs="Century" w:eastAsia="Century"/>
           <w:w w:val="105"/>
         </w:rPr>
-        <w:t xml:space="preserve">Future work can expand on this study in four key areas: (1) External Clinical Validation: testing the models on independent patient cohorts and cerebrospinal fluid (CSF) peptide samples to measure real-world diagnostic accuracy. (2) Pretrained Protein Language Models: evaluating transformer-based foundation models such as ESM-2 or ProtBERT to capture deeper biochemical representations. (3) Model Interpretability: using saliency methods like Integrated Gradients or DeepLIFT on the 1D-CNN and BiLSTM to identify the exact amino acid motifs driving aggregation predictions. (4) Nested Cross-Validation: running repeated nested cross-validation across all deep learning architectures to compute narrower statistical confidence intervals.</w:t>
+        <w:t xml:space="preserve">Future work can expand on this study in four areas: (1) External Clinical Validation: testing the models on independent patient cohorts and cerebrospinal fluid (CSF) peptide samples to measure real-world diagnostic accuracy. (2) Pretrained Protein Language Models: evaluating transformer-based foundation models such as ESM-2 or ProtBERT to capture deeper biochemical representations. (3) Model Interpretability: using saliency methods like Integrated Gradients or DeepLIFT on the 1D-CNN and BiLSTM to identify the exact amino acid motifs driving aggregation predictions. (4) Nested Cross-Validation: running repeated nested cross-validation across all deep learning architectures to compute narrower statistical confidence intervals.</w:t>
       </w:r>
     </w:p>
     <w:p>

</xml_diff>